<commit_message>
Update inquiry system and documentation
</commit_message>
<xml_diff>
--- a/Revivedentalspeciality.com Project manual (details).docx
+++ b/Revivedentalspeciality.com Project manual (details).docx
@@ -11,6 +11,10 @@
       </w:pPr>
       <w:r>
         <w:rPr>
+          <w:b/>
+          <w:bCs/>
+          <w:sz w:val="32"/>
+          <w:szCs w:val="32"/>
           <w:lang w:val="en-US"/>
         </w:rPr>
         <w:t xml:space="preserve">Brevo </w:t>
@@ -40,7 +44,7 @@
         </w:rPr>
         <w:br/>
       </w:r>
-      <w:hyperlink r:id="rId4" w:history="1">
+      <w:hyperlink r:id="rId5" w:history="1">
         <w:r>
           <w:rPr>
             <w:rStyle w:val="Hyperlink"/>
@@ -114,11 +118,27 @@
         <w:rPr>
           <w:lang w:val="en-US"/>
         </w:rPr>
+        <w:t>xsmtpsib-f99fde902a9ed2d2bac19038d47ada02c5423437487f642bc72f306a1a790298-fk4DOfJHHvd53yb9</w:t>
+      </w:r>
+      <w:r>
+        <w:rPr>
+          <w:lang w:val="en-US"/>
+        </w:rPr>
+        <w:br/>
+      </w:r>
+      <w:r>
+        <w:rPr>
+          <w:lang w:val="en-US"/>
+        </w:rPr>
         <w:br/>
       </w:r>
       <w:proofErr w:type="spellStart"/>
       <w:r>
         <w:rPr>
+          <w:b/>
+          <w:bCs/>
+          <w:sz w:val="32"/>
+          <w:szCs w:val="32"/>
           <w:lang w:val="en-US"/>
         </w:rPr>
         <w:t>Hostinger</w:t>
@@ -148,39 +168,1010 @@
         </w:rPr>
         <w:t xml:space="preserve">Username - </w:t>
       </w:r>
+      <w:r>
+        <w:t>revivedentalspecialityclinicp@gmail.com</w:t>
+      </w:r>
+      <w:r>
+        <w:rPr>
+          <w:lang w:val="en-US"/>
+        </w:rPr>
+        <w:br/>
+        <w:t xml:space="preserve">Password </w:t>
+      </w:r>
+      <w:r>
+        <w:rPr>
+          <w:lang w:val="en-US"/>
+        </w:rPr>
+        <w:t>–</w:t>
+      </w:r>
+      <w:r>
+        <w:rPr>
+          <w:lang w:val="en-US"/>
+        </w:rPr>
+        <w:t xml:space="preserve"> </w:t>
+      </w:r>
+      <w:r>
+        <w:rPr>
+          <w:lang w:val="en-US"/>
+        </w:rPr>
+        <w:t>Revivedentalspeciality@1234</w:t>
+      </w:r>
+    </w:p>
+    <w:p>
+      <w:pPr>
+        <w:rPr>
+          <w:lang w:val="en-US"/>
+        </w:rPr>
+      </w:pPr>
+      <w:r>
+        <w:rPr>
+          <w:lang w:val="en-US"/>
+        </w:rPr>
+        <w:br/>
+      </w:r>
+      <w:r>
+        <w:rPr>
+          <w:lang w:val="en-US"/>
+        </w:rPr>
+        <w:br/>
+      </w:r>
+      <w:r>
+        <w:rPr>
+          <w:b/>
+          <w:bCs/>
+          <w:sz w:val="32"/>
+          <w:szCs w:val="32"/>
+          <w:lang w:val="en-US"/>
+        </w:rPr>
+        <w:t xml:space="preserve">ADMIN </w:t>
+      </w:r>
+      <w:r>
+        <w:rPr>
+          <w:lang w:val="en-US"/>
+        </w:rPr>
+        <w:br/>
+      </w:r>
+      <w:r>
+        <w:rPr>
+          <w:lang w:val="en-US"/>
+        </w:rPr>
+        <w:br/>
+      </w:r>
+      <w:r>
+        <w:rPr>
+          <w:lang w:val="en-US"/>
+        </w:rPr>
+        <w:t>revivedentalclinicp@gmail.com</w:t>
+      </w:r>
+    </w:p>
+    <w:p>
+      <w:pPr>
+        <w:rPr>
+          <w:lang w:val="en-US"/>
+        </w:rPr>
+      </w:pPr>
+      <w:r>
+        <w:rPr>
+          <w:lang w:val="en-US"/>
+        </w:rPr>
+        <w:t>ReviveDental@2024</w:t>
+      </w:r>
+    </w:p>
+    <w:p>
+      <w:pPr>
+        <w:rPr>
+          <w:lang w:val="en-US"/>
+        </w:rPr>
+      </w:pPr>
+      <w:r>
+        <w:rPr>
+          <w:lang w:val="en-US"/>
+        </w:rPr>
+        <w:br/>
+      </w:r>
+      <w:r>
+        <w:rPr>
+          <w:lang w:val="en-US"/>
+        </w:rPr>
+        <w:br/>
+      </w:r>
+      <w:r>
+        <w:rPr>
+          <w:b/>
+          <w:bCs/>
+          <w:sz w:val="32"/>
+          <w:szCs w:val="32"/>
+          <w:lang w:val="en-US"/>
+        </w:rPr>
+        <w:t>IMP LINKS</w:t>
+      </w:r>
+      <w:r>
+        <w:rPr>
+          <w:sz w:val="32"/>
+          <w:szCs w:val="32"/>
+          <w:lang w:val="en-US"/>
+        </w:rPr>
+        <w:t xml:space="preserve"> </w:t>
+      </w:r>
+      <w:r>
+        <w:rPr>
+          <w:lang w:val="en-US"/>
+        </w:rPr>
+        <w:br/>
+      </w:r>
+      <w:r>
+        <w:rPr>
+          <w:lang w:val="en-US"/>
+        </w:rPr>
+        <w:br/>
+      </w:r>
+      <w:r>
+        <w:rPr>
+          <w:lang w:val="en-US"/>
+        </w:rPr>
+        <w:t>GitHub Repository: https://github.com/revivedentalclinicp/revivedentalclinic</w:t>
+      </w:r>
+    </w:p>
+    <w:p>
+      <w:pPr>
+        <w:rPr>
+          <w:lang w:val="en-US"/>
+        </w:rPr>
+      </w:pPr>
+      <w:r>
+        <w:rPr>
+          <w:lang w:val="en-US"/>
+        </w:rPr>
+        <w:t>Frontend Live Deployment (Render): https://revivedentalspeciality.onrender.com</w:t>
+      </w:r>
+    </w:p>
+    <w:p>
+      <w:pPr>
+        <w:rPr>
+          <w:lang w:val="en-US"/>
+        </w:rPr>
+      </w:pPr>
+      <w:r>
+        <w:rPr>
+          <w:lang w:val="en-US"/>
+        </w:rPr>
+        <w:t xml:space="preserve">Backend API Remote Deployment (Render): </w:t>
+      </w:r>
+      <w:hyperlink r:id="rId6" w:history="1">
+        <w:r>
+          <w:rPr>
+            <w:rStyle w:val="Hyperlink"/>
+            <w:lang w:val="en-US"/>
+          </w:rPr>
+          <w:t>https://revivedentalbackend.onrender.com</w:t>
+        </w:r>
+      </w:hyperlink>
+    </w:p>
+    <w:p>
+      <w:pPr>
+        <w:rPr>
+          <w:b/>
+          <w:bCs/>
+          <w:sz w:val="32"/>
+          <w:szCs w:val="32"/>
+        </w:rPr>
+      </w:pPr>
+      <w:r>
+        <w:rPr>
+          <w:b/>
+          <w:bCs/>
+          <w:sz w:val="32"/>
+          <w:szCs w:val="32"/>
+        </w:rPr>
+        <w:t>Get your Brevo API Key</w:t>
+      </w:r>
+    </w:p>
+    <w:p>
+      <w:pPr>
+        <w:rPr>
+          <w:sz w:val="24"/>
+          <w:szCs w:val="24"/>
+        </w:rPr>
+      </w:pPr>
+      <w:r>
+        <w:rPr>
+          <w:sz w:val="24"/>
+          <w:szCs w:val="24"/>
+        </w:rPr>
+        <w:t>Render Backend</w:t>
+      </w:r>
+    </w:p>
+    <w:p>
+      <w:pPr>
+        <w:rPr>
+          <w:sz w:val="24"/>
+          <w:szCs w:val="24"/>
+        </w:rPr>
+      </w:pPr>
+      <w:r>
+        <w:rPr>
+          <w:sz w:val="24"/>
+          <w:szCs w:val="24"/>
+        </w:rPr>
+        <w:t>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</w:t>
+      </w:r>
+    </w:p>
+    <w:p>
+      <w:pPr>
+        <w:rPr>
+          <w:lang w:val="en-US"/>
+        </w:rPr>
+      </w:pPr>
+    </w:p>
+    <w:p>
+      <w:r>
+        <w:t>The local server works perfectly, but </w:t>
+      </w:r>
+      <w:r>
+        <w:rPr>
+          <w:b/>
+          <w:bCs/>
+        </w:rPr>
+        <w:t>Render is timing out when connecting to Brevo's SMTP server (Port 587)</w:t>
+      </w:r>
+      <w:r>
+        <w:t>. This is a very common issue on cloud platforms like Render, where outbound SMTP ports are heavily filtered or slow.</w:t>
+      </w:r>
+    </w:p>
+    <w:p>
+      <w:r>
+        <w:t>To solve this permanently, I have rewritten emailService.js to use a </w:t>
+      </w:r>
+      <w:r>
+        <w:rPr>
+          <w:b/>
+          <w:bCs/>
+        </w:rPr>
+        <w:t>Dual-Delivery System</w:t>
+      </w:r>
+      <w:r>
+        <w:t>:</w:t>
+      </w:r>
+    </w:p>
+    <w:p>
+      <w:pPr>
+        <w:numPr>
+          <w:ilvl w:val="0"/>
+          <w:numId w:val="1"/>
+        </w:numPr>
+      </w:pPr>
+      <w:r>
+        <w:t>It tries standard SMTP first.</w:t>
+      </w:r>
+    </w:p>
+    <w:p>
+      <w:pPr>
+        <w:numPr>
+          <w:ilvl w:val="0"/>
+          <w:numId w:val="1"/>
+        </w:numPr>
+      </w:pPr>
+      <w:r>
+        <w:t>If SMTP times out or fails (like it did on Render), it instantly falls back to </w:t>
+      </w:r>
+      <w:r>
+        <w:rPr>
+          <w:b/>
+          <w:bCs/>
+        </w:rPr>
+        <w:t>Brevo's HTTP REST API</w:t>
+      </w:r>
+      <w:r>
+        <w:t>, which operates over standard port 443 (HTTPS) and </w:t>
+      </w:r>
+      <w:r>
+        <w:rPr>
+          <w:b/>
+          <w:bCs/>
+        </w:rPr>
+        <w:t>never gets blocked by Render</w:t>
+      </w:r>
+      <w:r>
+        <w:t>.</w:t>
+      </w:r>
+    </w:p>
+    <w:p>
+      <w:r>
+        <w:t>I have already </w:t>
+      </w:r>
+      <w:r>
+        <w:rPr>
+          <w:b/>
+          <w:bCs/>
+        </w:rPr>
+        <w:t>pushed this new code to GitHub</w:t>
+      </w:r>
+      <w:r>
+        <w:t>.</w:t>
+      </w:r>
+    </w:p>
+    <w:p>
+      <w:r>
+        <w:t>To make the HTTP API work on Render, you just need to add the </w:t>
+      </w:r>
+      <w:r>
+        <w:rPr>
+          <w:b/>
+          <w:bCs/>
+        </w:rPr>
+        <w:t>Brevo API Key</w:t>
+      </w:r>
+      <w:r>
+        <w:t>. Here is exactly what you need to do:</w:t>
+      </w:r>
+    </w:p>
+    <w:p>
+      <w:r>
+        <w:pict w14:anchorId="50C17630">
+          <v:rect id="_x0000_i1037" style="width:180.3pt;height:.75pt" o:hrpct="0" o:hralign="center" o:hrstd="t" o:hr="t" fillcolor="#a0a0a0" stroked="f"/>
+        </w:pict>
+      </w:r>
+    </w:p>
+    <w:p>
+      <w:r>
+        <w:t>Step 1 — Get your Brevo API Key</w:t>
+      </w:r>
+    </w:p>
+    <w:p>
+      <w:pPr>
+        <w:numPr>
+          <w:ilvl w:val="0"/>
+          <w:numId w:val="2"/>
+        </w:numPr>
+      </w:pPr>
+      <w:r>
+        <w:t>Go to </w:t>
+      </w:r>
+      <w:hyperlink r:id="rId7" w:history="1">
+        <w:r>
+          <w:rPr>
+            <w:rStyle w:val="Hyperlink"/>
+            <w:b/>
+            <w:bCs/>
+          </w:rPr>
+          <w:t>app.brevo.com/settings/keys/</w:t>
+        </w:r>
+        <w:proofErr w:type="spellStart"/>
+        <w:r>
+          <w:rPr>
+            <w:rStyle w:val="Hyperlink"/>
+            <w:b/>
+            <w:bCs/>
+          </w:rPr>
+          <w:t>apikey</w:t>
+        </w:r>
+        <w:proofErr w:type="spellEnd"/>
+      </w:hyperlink>
+    </w:p>
+    <w:p>
+      <w:pPr>
+        <w:numPr>
+          <w:ilvl w:val="0"/>
+          <w:numId w:val="2"/>
+        </w:numPr>
+      </w:pPr>
+      <w:r>
+        <w:t>Click </w:t>
+      </w:r>
+      <w:r>
+        <w:rPr>
+          <w:b/>
+          <w:bCs/>
+        </w:rPr>
+        <w:t>Generate a new API key</w:t>
+      </w:r>
+    </w:p>
+    <w:p>
+      <w:pPr>
+        <w:numPr>
+          <w:ilvl w:val="0"/>
+          <w:numId w:val="2"/>
+        </w:numPr>
+      </w:pPr>
+      <w:r>
+        <w:t>Name it "Render Backend" and copy the key.</w:t>
+      </w:r>
+    </w:p>
+    <w:p>
+      <w:r>
+        <w:t>Step 2 — Add it to Render Environment Variables</w:t>
+      </w:r>
+    </w:p>
+    <w:p>
+      <w:r>
+        <w:t>Go to your </w:t>
+      </w:r>
+      <w:r>
+        <w:rPr>
+          <w:b/>
+          <w:bCs/>
+        </w:rPr>
+        <w:t>Render dashboard</w:t>
+      </w:r>
+      <w:r>
+        <w:t> → Your Backend Service → </w:t>
+      </w:r>
+      <w:r>
+        <w:rPr>
+          <w:b/>
+          <w:bCs/>
+        </w:rPr>
+        <w:t>Environment</w:t>
+      </w:r>
+      <w:r>
+        <w:t>, and add:</w:t>
+      </w:r>
+    </w:p>
+    <w:p>
+      <w:r>
+        <w:t>KEY:   BREVO_API_KEY</w:t>
+      </w:r>
+    </w:p>
+    <w:p>
+      <w:r>
+        <w:t>VALUE: &lt;paste your new Brevo API key here&gt;</w:t>
+      </w:r>
+    </w:p>
+    <w:p>
+      <w:r>
+        <w:rPr>
+          <w:i/>
+          <w:iCs/>
+        </w:rPr>
+        <w:t>(Ensure EMAIL_USER, EMAIL_PASS, and EMAIL_FROM are also still there from earlier).</w:t>
+      </w:r>
+    </w:p>
+    <w:p>
+      <w:r>
+        <w:t>Step 3 — Redeploy Render</w:t>
+      </w:r>
+    </w:p>
+    <w:p>
+      <w:r>
+        <w:t>Because I pushed the new code to GitHub, Render might have already started deploying.</w:t>
+      </w:r>
+    </w:p>
+    <w:p>
+      <w:pPr>
+        <w:numPr>
+          <w:ilvl w:val="0"/>
+          <w:numId w:val="3"/>
+        </w:numPr>
+      </w:pPr>
+      <w:r>
+        <w:t>Go to the </w:t>
+      </w:r>
+      <w:r>
+        <w:rPr>
+          <w:b/>
+          <w:bCs/>
+        </w:rPr>
+        <w:t>Events</w:t>
+      </w:r>
+      <w:r>
+        <w:t> or </w:t>
+      </w:r>
+      <w:r>
+        <w:rPr>
+          <w:b/>
+          <w:bCs/>
+        </w:rPr>
+        <w:t>Deploy</w:t>
+      </w:r>
+      <w:r>
+        <w:t> tab on your Render dashboard.</w:t>
+      </w:r>
+    </w:p>
+    <w:p>
+      <w:pPr>
+        <w:numPr>
+          <w:ilvl w:val="0"/>
+          <w:numId w:val="3"/>
+        </w:numPr>
+      </w:pPr>
+      <w:r>
+        <w:t>If it hasn't deployed the latest commit ("fix: Add Brevo HTTP API fallback..."), click </w:t>
+      </w:r>
+      <w:r>
+        <w:rPr>
+          <w:b/>
+          <w:bCs/>
+        </w:rPr>
+        <w:t>Manual Deploy</w:t>
+      </w:r>
+      <w:r>
+        <w:t> → </w:t>
+      </w:r>
+      <w:r>
+        <w:rPr>
+          <w:b/>
+          <w:bCs/>
+        </w:rPr>
+        <w:t>Deploy latest commit</w:t>
+      </w:r>
+      <w:r>
+        <w:t>.</w:t>
+      </w:r>
+    </w:p>
+    <w:p>
+      <w:r>
+        <w:pict w14:anchorId="28E00168">
+          <v:rect id="_x0000_i1038" style="width:180.3pt;height:.75pt" o:hrpct="0" o:hralign="center" o:hrstd="t" o:hr="t" fillcolor="#a0a0a0" stroked="f"/>
+        </w:pict>
+      </w:r>
+    </w:p>
+    <w:p>
+      <w:r>
+        <w:t>Step 4 — Verify Live on Production!</w:t>
+      </w:r>
+    </w:p>
+    <w:p>
+      <w:r>
+        <w:t>Once Render finishes deploying, wait a minute for it to wake up, then visit your live production test URL directly in your browser:</w:t>
+      </w:r>
+    </w:p>
+    <w:p>
+      <w:r>
+        <w:rPr>
+          <w:rFonts w:ascii="Segoe UI Emoji" w:hAnsi="Segoe UI Emoji" w:cs="Segoe UI Emoji"/>
+        </w:rPr>
+        <w:t>👉</w:t>
+      </w:r>
+      <w:r>
+        <w:t> </w:t>
+      </w:r>
+      <w:hyperlink r:id="rId8" w:history="1">
+        <w:r>
+          <w:rPr>
+            <w:rStyle w:val="Hyperlink"/>
+            <w:b/>
+            <w:bCs/>
+          </w:rPr>
+          <w:t>https://revivedentalbackend.onrender.com/test-email?to=revivedentalclinicp@gmail.com</w:t>
+        </w:r>
+      </w:hyperlink>
+    </w:p>
+    <w:p>
+      <w:r>
+        <w:t>It should say success: true and the email will be delivered to your inbox instantly! All booking, approval, and rejection emails will now flow perfectly in production.</w:t>
+      </w:r>
+    </w:p>
+    <w:p>
+      <w:r>
+        <w:lastRenderedPageBreak/>
+        <w:t xml:space="preserve">push this changes to </w:t>
+      </w:r>
       <w:proofErr w:type="spellStart"/>
       <w:r>
-        <w:t>revivedentalspecialityclinicp@gmail.com</w:t>
-      </w:r>
-      <w:r>
-        <w:t>s</w:t>
+        <w:t>github</w:t>
       </w:r>
       <w:proofErr w:type="spellEnd"/>
       <w:r>
-        <w:rPr>
-          <w:lang w:val="en-US"/>
-        </w:rPr>
-        <w:br/>
-        <w:t xml:space="preserve">Password </w:t>
-      </w:r>
-      <w:r>
-        <w:rPr>
-          <w:lang w:val="en-US"/>
-        </w:rPr>
-        <w:t>–</w:t>
-      </w:r>
-      <w:r>
-        <w:rPr>
-          <w:lang w:val="en-US"/>
-        </w:rPr>
-        <w:t xml:space="preserve"> </w:t>
-      </w:r>
-      <w:r>
-        <w:rPr>
-          <w:lang w:val="en-US"/>
-        </w:rPr>
-        <w:t>Revivedentalspeciality@1234</w:t>
-      </w:r>
+        <w:t xml:space="preserve"> and explain what </w:t>
+      </w:r>
+      <w:proofErr w:type="spellStart"/>
+      <w:r>
+        <w:t>erroes</w:t>
+      </w:r>
+      <w:proofErr w:type="spellEnd"/>
+      <w:r>
+        <w:t xml:space="preserve"> are </w:t>
+      </w:r>
+      <w:proofErr w:type="spellStart"/>
+      <w:r>
+        <w:t>occuring</w:t>
+      </w:r>
+      <w:proofErr w:type="spellEnd"/>
+      <w:r>
+        <w:t xml:space="preserve"> with smtp </w:t>
+      </w:r>
+      <w:proofErr w:type="spellStart"/>
+      <w:r>
+        <w:t>andhow</w:t>
+      </w:r>
+      <w:proofErr w:type="spellEnd"/>
+      <w:r>
+        <w:t xml:space="preserve"> do you solve them using </w:t>
+      </w:r>
+      <w:proofErr w:type="spellStart"/>
+      <w:r>
+        <w:t>api</w:t>
+      </w:r>
+      <w:proofErr w:type="spellEnd"/>
+      <w:r>
+        <w:t xml:space="preserve"> key </w:t>
+      </w:r>
+    </w:p>
+    <w:p>
+      <w:r>
+        <w:t>I have already pushed all the code changes to GitHub in my previous step! Your main branch is fully up-to-date with the new dual-delivery email system.</w:t>
+      </w:r>
+    </w:p>
+    <w:p>
+      <w:r>
+        <w:t>Here is a clear explanation of exactly what was going wrong in production and how the API Key fallback solves it:</w:t>
+      </w:r>
+    </w:p>
+    <w:p>
+      <w:r>
+        <w:rPr>
+          <w:rFonts w:ascii="Segoe UI Emoji" w:hAnsi="Segoe UI Emoji" w:cs="Segoe UI Emoji"/>
+        </w:rPr>
+        <w:t>🔴</w:t>
+      </w:r>
+      <w:r>
+        <w:t xml:space="preserve"> The Problem: Cloud Hosts Block SMTP Ports (The "Hanging" Issue)</w:t>
+      </w:r>
+    </w:p>
+    <w:p>
+      <w:r>
+        <w:t>When we tested the backend locally on your Windows machine, emails sent perfectly. But when we tested on Render, the request just hung and eventually returned a Timeout error.</w:t>
+      </w:r>
+    </w:p>
+    <w:p>
+      <w:r>
+        <w:t>Why did this happen? Traditional email relies on the </w:t>
+      </w:r>
+      <w:r>
+        <w:rPr>
+          <w:b/>
+          <w:bCs/>
+        </w:rPr>
+        <w:t>SMTP Protocol</w:t>
+      </w:r>
+      <w:r>
+        <w:t> which uses </w:t>
+      </w:r>
+      <w:r>
+        <w:rPr>
+          <w:b/>
+          <w:bCs/>
+        </w:rPr>
+        <w:t>Port 587</w:t>
+      </w:r>
+      <w:r>
+        <w:t> or </w:t>
+      </w:r>
+      <w:r>
+        <w:rPr>
+          <w:b/>
+          <w:bCs/>
+        </w:rPr>
+        <w:t>Port 465</w:t>
+      </w:r>
+      <w:r>
+        <w:t xml:space="preserve">. Cloud hosting platforms (like Render, Heroku, </w:t>
+      </w:r>
+      <w:proofErr w:type="spellStart"/>
+      <w:r>
+        <w:t>Vercel</w:t>
+      </w:r>
+      <w:proofErr w:type="spellEnd"/>
+      <w:r>
+        <w:t>, AWS, etc.) are terrified of their servers being used to send spam. To protect their IP reputation, they heavily throttle, filter, or outright </w:t>
+      </w:r>
+      <w:r>
+        <w:rPr>
+          <w:b/>
+          <w:bCs/>
+        </w:rPr>
+        <w:t>block outbound traffic on SMTP ports</w:t>
+      </w:r>
+      <w:r>
+        <w:t> on their free and lower-tier plans.</w:t>
+      </w:r>
+    </w:p>
+    <w:p>
+      <w:r>
+        <w:t>So, when your Render backend tried to contact smtp-relay.brevo.com:587, Render's firewall silently dropped the connection, causing Node.js to wait endlessly until it timed out.</w:t>
+      </w:r>
+    </w:p>
+    <w:p>
+      <w:r>
+        <w:rPr>
+          <w:rFonts w:ascii="Segoe UI Emoji" w:hAnsi="Segoe UI Emoji" w:cs="Segoe UI Emoji"/>
+        </w:rPr>
+        <w:t>✅</w:t>
+      </w:r>
+      <w:r>
+        <w:t xml:space="preserve"> The Solution: Bypassing SMTP with the Brevo REST API</w:t>
+      </w:r>
+    </w:p>
+    <w:p>
+      <w:r>
+        <w:t>To solve this, we stopped fighting the SMTP block and switched to modern web protocols.</w:t>
+      </w:r>
+    </w:p>
+    <w:p>
+      <w:r>
+        <w:t>Almost all modern email providers (Brevo, SendGrid, Resend) offer an </w:t>
+      </w:r>
+      <w:r>
+        <w:rPr>
+          <w:b/>
+          <w:bCs/>
+        </w:rPr>
+        <w:t>HTTP REST API</w:t>
+      </w:r>
+      <w:r>
+        <w:t> alongside traditional SMTP. Instead of establishing a complex SMTP handshake on Port 587, we simply send a standard </w:t>
+      </w:r>
+      <w:proofErr w:type="gramStart"/>
+      <w:r>
+        <w:t>fetch(</w:t>
+      </w:r>
+      <w:proofErr w:type="gramEnd"/>
+      <w:r>
+        <w:t>) POST request to Brevo's API endpoint over </w:t>
+      </w:r>
+      <w:r>
+        <w:rPr>
+          <w:b/>
+          <w:bCs/>
+        </w:rPr>
+        <w:t>Port 443 (HTTPS)</w:t>
+      </w:r>
+      <w:r>
+        <w:t>.</w:t>
+      </w:r>
+    </w:p>
+    <w:p>
+      <w:pPr>
+        <w:numPr>
+          <w:ilvl w:val="0"/>
+          <w:numId w:val="4"/>
+        </w:numPr>
+      </w:pPr>
+      <w:r>
+        <w:rPr>
+          <w:b/>
+          <w:bCs/>
+        </w:rPr>
+        <w:t>Render NEVER blocks Port 443</w:t>
+      </w:r>
+      <w:r>
+        <w:t> because that is the standard port used for all secure web traffic.</w:t>
+      </w:r>
+    </w:p>
+    <w:p>
+      <w:r>
+        <w:rPr>
+          <w:rFonts w:ascii="Segoe UI Emoji" w:hAnsi="Segoe UI Emoji" w:cs="Segoe UI Emoji"/>
+        </w:rPr>
+        <w:t>⚙️</w:t>
+      </w:r>
+      <w:r>
+        <w:t xml:space="preserve"> How your new emailService.js works:</w:t>
+      </w:r>
+    </w:p>
+    <w:p>
+      <w:pPr>
+        <w:numPr>
+          <w:ilvl w:val="0"/>
+          <w:numId w:val="5"/>
+        </w:numPr>
+      </w:pPr>
+      <w:r>
+        <w:rPr>
+          <w:b/>
+          <w:bCs/>
+        </w:rPr>
+        <w:t>The Attempt:</w:t>
+      </w:r>
+      <w:r>
+        <w:t> It still tries to send via SMTP first (just in case it works). I added aggressive timeouts so that if Render drops the connection, the code doesn't hang forever—it fails fast within 10 seconds.</w:t>
+      </w:r>
+    </w:p>
+    <w:p>
+      <w:pPr>
+        <w:numPr>
+          <w:ilvl w:val="0"/>
+          <w:numId w:val="5"/>
+        </w:numPr>
+      </w:pPr>
+      <w:r>
+        <w:rPr>
+          <w:b/>
+          <w:bCs/>
+        </w:rPr>
+        <w:t>The Catch:</w:t>
+      </w:r>
+      <w:r>
+        <w:t> If SMTP throws an error or times out, the catch (err) block intercepts it.</w:t>
+      </w:r>
+    </w:p>
+    <w:p>
+      <w:pPr>
+        <w:numPr>
+          <w:ilvl w:val="0"/>
+          <w:numId w:val="5"/>
+        </w:numPr>
+      </w:pPr>
+      <w:r>
+        <w:rPr>
+          <w:b/>
+          <w:bCs/>
+        </w:rPr>
+        <w:t>The Fallback:</w:t>
+      </w:r>
+      <w:r>
+        <w:t> It immediately executes </w:t>
+      </w:r>
+      <w:proofErr w:type="spellStart"/>
+      <w:proofErr w:type="gramStart"/>
+      <w:r>
+        <w:t>sendViaBrevoAPI</w:t>
+      </w:r>
+      <w:proofErr w:type="spellEnd"/>
+      <w:r>
+        <w:t>(</w:t>
+      </w:r>
+      <w:proofErr w:type="gramEnd"/>
+      <w:r>
+        <w:t>). This function takes the exact same email data, attaches your BREVO_API_KEY in the headers for authentication, and fires a standard HTTP POST request to Brevo.</w:t>
+      </w:r>
+    </w:p>
+    <w:p>
+      <w:r>
+        <w:t>This guarantees that even if Render is strictly blocking traditional email ports, your clinic's booking and status notifications will </w:t>
+      </w:r>
+      <w:r>
+        <w:rPr>
+          <w:b/>
+          <w:bCs/>
+        </w:rPr>
+        <w:t>always</w:t>
+      </w:r>
+      <w:r>
+        <w:t> get delivered reliably over standard web requests!</w:t>
+      </w:r>
+    </w:p>
+    <w:p>
+      <w:r>
+        <w:rPr>
+          <w:lang w:val="en-US"/>
+        </w:rPr>
+        <w:br/>
+      </w:r>
+      <w:r>
+        <w:rPr>
+          <w:lang w:val="en-US"/>
+        </w:rPr>
+        <w:br/>
+      </w:r>
+      <w:r>
+        <w:rPr>
+          <w:lang w:val="en-US"/>
+        </w:rPr>
+        <w:br/>
+      </w:r>
+      <w:r>
+        <w:rPr>
+          <w:lang w:val="en-US"/>
+        </w:rPr>
+        <w:br/>
+      </w:r>
+      <w:r>
+        <w:rPr>
+          <w:lang w:val="en-US"/>
+        </w:rPr>
+        <w:br/>
+      </w:r>
+      <w:r>
+        <w:rPr>
+          <w:lang w:val="en-US"/>
+        </w:rPr>
+        <w:br/>
+      </w:r>
+      <w:r>
+        <w:rPr>
+          <w:lang w:val="en-US"/>
+        </w:rPr>
+        <w:br/>
+      </w:r>
+      <w:r>
+        <w:rPr>
+          <w:lang w:val="en-US"/>
+        </w:rPr>
+        <w:lastRenderedPageBreak/>
+        <w:br/>
+      </w:r>
+      <w:r>
+        <w:rPr>
+          <w:lang w:val="en-US"/>
+        </w:rPr>
+        <w:br/>
+      </w:r>
+      <w:r>
+        <w:rPr>
+          <w:lang w:val="en-US"/>
+        </w:rPr>
+        <w:br/>
+      </w:r>
+      <w:r>
+        <w:rPr>
+          <w:lang w:val="en-US"/>
+        </w:rPr>
+        <w:br/>
+      </w:r>
+      <w:r>
+        <w:t>In professional web development, .env files contain highly sensitive secrets (like your Brevo SMTP password, Firebase Private Keys, and Admin Emails). Because of this, your .</w:t>
+      </w:r>
+      <w:proofErr w:type="spellStart"/>
+      <w:r>
+        <w:t>gitignore</w:t>
+      </w:r>
+      <w:proofErr w:type="spellEnd"/>
+      <w:r>
+        <w:t> file is programmed to strictly </w:t>
+      </w:r>
+      <w:r>
+        <w:rPr>
+          <w:b/>
+          <w:bCs/>
+        </w:rPr>
+        <w:t>prevent .env from ever being uploaded to GitHub</w:t>
+      </w:r>
+      <w:r>
+        <w:t>. If it were uploaded, anyone on the internet could steal your passwords and hijack your email account.</w:t>
+      </w:r>
+    </w:p>
+    <w:p>
+      <w:r>
+        <w:t>Your main code (server.js, adminService.js, etc.) is </w:t>
+      </w:r>
+      <w:r>
+        <w:rPr>
+          <w:b/>
+          <w:bCs/>
+        </w:rPr>
+        <w:t>already 100% up-to-date on GitHub</w:t>
+      </w:r>
+      <w:r>
+        <w:t> from our previous push!</w:t>
+      </w:r>
+    </w:p>
+    <w:p>
+      <w:r>
+        <w:t>Because the .env file cannot be pushed to GitHub, </w:t>
+      </w:r>
+      <w:r>
+        <w:rPr>
+          <w:b/>
+          <w:bCs/>
+        </w:rPr>
+        <w:t>Render cannot pull it from GitHub</w:t>
+      </w:r>
+      <w:r>
+        <w:t>. This is exactly why you must manually copy and paste the ADMIN_EMAILS variable directly into the </w:t>
+      </w:r>
+      <w:r>
+        <w:rPr>
+          <w:b/>
+          <w:bCs/>
+        </w:rPr>
+        <w:t>Render Dashboard Environment Variables</w:t>
+      </w:r>
+      <w:r>
+        <w:t> section as I mentioned earlier.</w:t>
+      </w:r>
+    </w:p>
+    <w:p>
+      <w:r>
+        <w:t>Once you paste it into Render, your production site will be fully synced and ready to go!</w:t>
+      </w:r>
+    </w:p>
+    <w:p>
+      <w:pPr>
+        <w:rPr>
+          <w:lang w:val="en-US"/>
+        </w:rPr>
+      </w:pPr>
     </w:p>
     <w:sectPr>
       <w:pgSz w:w="11906" w:h="16838"/>
@@ -190,6 +1181,627 @@
     </w:sectPr>
   </w:body>
 </w:document>
+</file>
+
+<file path=word/numbering.xml><?xml version="1.0" encoding="utf-8"?>
+<w:numbering xmlns:wpc="http://schemas.microsoft.com/office/word/2010/wordprocessingCanvas" xmlns:cx="http://schemas.microsoft.com/office/drawing/2014/chartex" xmlns:cx1="http://schemas.microsoft.com/office/drawing/2015/9/8/chartex" xmlns:cx2="http://schemas.microsoft.com/office/drawing/2015/10/21/chartex" xmlns:cx3="http://schemas.microsoft.com/office/drawing/2016/5/9/chartex" xmlns:cx4="http://schemas.microsoft.com/office/drawing/2016/5/10/chartex" xmlns:cx5="http://schemas.microsoft.com/office/drawing/2016/5/11/chartex" xmlns:cx6="http://schemas.microsoft.com/office/drawing/2016/5/12/chartex" xmlns:cx7="http://schemas.microsoft.com/office/drawing/2016/5/13/chartex" xmlns:cx8="http://schemas.microsoft.com/office/drawing/2016/5/14/chartex" xmlns:mc="http://schemas.openxmlformats.org/markup-compatibility/2006" xmlns:aink="http://schemas.microsoft.com/office/drawing/2016/ink" xmlns:am3d="http://schemas.microsoft.com/office/drawing/2017/model3d" xmlns:o="urn:schemas-microsoft-com:office:office" xmlns:oel="http://schemas.microsoft.com/office/2019/extlst" xmlns:r="http://schemas.openxmlformats.org/officeDocument/2006/relationships" xmlns:m="http://schemas.openxmlformats.org/officeDocument/2006/math" xmlns:v="urn:schemas-microsoft-com:vml" xmlns:wp14="http://schemas.microsoft.com/office/word/2010/wordprocessingDrawing" xmlns:wp="http://schemas.openxmlformats.org/drawingml/2006/wordprocessingDrawing" xmlns:w10="urn:schemas-microsoft-com:office:word" xmlns:w="http://schemas.openxmlformats.org/wordprocessingml/2006/main" xmlns:w14="http://schemas.microsoft.com/office/word/2010/wordml" xmlns:w15="http://schemas.microsoft.com/office/word/2012/wordml" xmlns:w16cex="http://schemas.microsoft.com/office/word/2018/wordml/cex" xmlns:w16cid="http://schemas.microsoft.com/office/word/2016/wordml/cid" xmlns:w16="http://schemas.microsoft.com/office/word/2018/wordml" xmlns:w16du="http://schemas.microsoft.com/office/word/2023/wordml/word16du" xmlns:w16sdtdh="http://schemas.microsoft.com/office/word/2020/wordml/sdtdatahash" xmlns:w16sdtfl="http://schemas.microsoft.com/office/word/2024/wordml/sdtformatlock" xmlns:w16se="http://schemas.microsoft.com/office/word/2015/wordml/symex" xmlns:wpg="http://schemas.microsoft.com/office/word/2010/wordprocessingGroup" xmlns:wpi="http://schemas.microsoft.com/office/word/2010/wordprocessingInk" xmlns:wne="http://schemas.microsoft.com/office/word/2006/wordml" xmlns:wps="http://schemas.microsoft.com/office/word/2010/wordprocessingShape" mc:Ignorable="w14 w15 w16se w16cid w16 w16cex w16sdtdh w16sdtfl w16du wp14">
+  <w:abstractNum w:abstractNumId="0" w15:restartNumberingAfterBreak="0">
+    <w:nsid w:val="1DD07C81"/>
+    <w:multiLevelType w:val="multilevel"/>
+    <w:tmpl w:val="4DEE3712"/>
+    <w:lvl w:ilvl="0">
+      <w:start w:val="1"/>
+      <w:numFmt w:val="decimal"/>
+      <w:lvlText w:val="%1."/>
+      <w:lvlJc w:val="left"/>
+      <w:pPr>
+        <w:tabs>
+          <w:tab w:val="num" w:pos="720"/>
+        </w:tabs>
+        <w:ind w:left="720" w:hanging="360"/>
+      </w:pPr>
+    </w:lvl>
+    <w:lvl w:ilvl="1" w:tentative="1">
+      <w:start w:val="1"/>
+      <w:numFmt w:val="decimal"/>
+      <w:lvlText w:val="%2."/>
+      <w:lvlJc w:val="left"/>
+      <w:pPr>
+        <w:tabs>
+          <w:tab w:val="num" w:pos="1440"/>
+        </w:tabs>
+        <w:ind w:left="1440" w:hanging="360"/>
+      </w:pPr>
+    </w:lvl>
+    <w:lvl w:ilvl="2" w:tentative="1">
+      <w:start w:val="1"/>
+      <w:numFmt w:val="decimal"/>
+      <w:lvlText w:val="%3."/>
+      <w:lvlJc w:val="left"/>
+      <w:pPr>
+        <w:tabs>
+          <w:tab w:val="num" w:pos="2160"/>
+        </w:tabs>
+        <w:ind w:left="2160" w:hanging="360"/>
+      </w:pPr>
+    </w:lvl>
+    <w:lvl w:ilvl="3" w:tentative="1">
+      <w:start w:val="1"/>
+      <w:numFmt w:val="decimal"/>
+      <w:lvlText w:val="%4."/>
+      <w:lvlJc w:val="left"/>
+      <w:pPr>
+        <w:tabs>
+          <w:tab w:val="num" w:pos="2880"/>
+        </w:tabs>
+        <w:ind w:left="2880" w:hanging="360"/>
+      </w:pPr>
+    </w:lvl>
+    <w:lvl w:ilvl="4" w:tentative="1">
+      <w:start w:val="1"/>
+      <w:numFmt w:val="decimal"/>
+      <w:lvlText w:val="%5."/>
+      <w:lvlJc w:val="left"/>
+      <w:pPr>
+        <w:tabs>
+          <w:tab w:val="num" w:pos="3600"/>
+        </w:tabs>
+        <w:ind w:left="3600" w:hanging="360"/>
+      </w:pPr>
+    </w:lvl>
+    <w:lvl w:ilvl="5" w:tentative="1">
+      <w:start w:val="1"/>
+      <w:numFmt w:val="decimal"/>
+      <w:lvlText w:val="%6."/>
+      <w:lvlJc w:val="left"/>
+      <w:pPr>
+        <w:tabs>
+          <w:tab w:val="num" w:pos="4320"/>
+        </w:tabs>
+        <w:ind w:left="4320" w:hanging="360"/>
+      </w:pPr>
+    </w:lvl>
+    <w:lvl w:ilvl="6" w:tentative="1">
+      <w:start w:val="1"/>
+      <w:numFmt w:val="decimal"/>
+      <w:lvlText w:val="%7."/>
+      <w:lvlJc w:val="left"/>
+      <w:pPr>
+        <w:tabs>
+          <w:tab w:val="num" w:pos="5040"/>
+        </w:tabs>
+        <w:ind w:left="5040" w:hanging="360"/>
+      </w:pPr>
+    </w:lvl>
+    <w:lvl w:ilvl="7" w:tentative="1">
+      <w:start w:val="1"/>
+      <w:numFmt w:val="decimal"/>
+      <w:lvlText w:val="%8."/>
+      <w:lvlJc w:val="left"/>
+      <w:pPr>
+        <w:tabs>
+          <w:tab w:val="num" w:pos="5760"/>
+        </w:tabs>
+        <w:ind w:left="5760" w:hanging="360"/>
+      </w:pPr>
+    </w:lvl>
+    <w:lvl w:ilvl="8" w:tentative="1">
+      <w:start w:val="1"/>
+      <w:numFmt w:val="decimal"/>
+      <w:lvlText w:val="%9."/>
+      <w:lvlJc w:val="left"/>
+      <w:pPr>
+        <w:tabs>
+          <w:tab w:val="num" w:pos="6480"/>
+        </w:tabs>
+        <w:ind w:left="6480" w:hanging="360"/>
+      </w:pPr>
+    </w:lvl>
+  </w:abstractNum>
+  <w:abstractNum w:abstractNumId="1" w15:restartNumberingAfterBreak="0">
+    <w:nsid w:val="2E217185"/>
+    <w:multiLevelType w:val="multilevel"/>
+    <w:tmpl w:val="95101E8C"/>
+    <w:lvl w:ilvl="0">
+      <w:start w:val="1"/>
+      <w:numFmt w:val="decimal"/>
+      <w:lvlText w:val="%1."/>
+      <w:lvlJc w:val="left"/>
+      <w:pPr>
+        <w:tabs>
+          <w:tab w:val="num" w:pos="720"/>
+        </w:tabs>
+        <w:ind w:left="720" w:hanging="360"/>
+      </w:pPr>
+    </w:lvl>
+    <w:lvl w:ilvl="1" w:tentative="1">
+      <w:start w:val="1"/>
+      <w:numFmt w:val="decimal"/>
+      <w:lvlText w:val="%2."/>
+      <w:lvlJc w:val="left"/>
+      <w:pPr>
+        <w:tabs>
+          <w:tab w:val="num" w:pos="1440"/>
+        </w:tabs>
+        <w:ind w:left="1440" w:hanging="360"/>
+      </w:pPr>
+    </w:lvl>
+    <w:lvl w:ilvl="2" w:tentative="1">
+      <w:start w:val="1"/>
+      <w:numFmt w:val="decimal"/>
+      <w:lvlText w:val="%3."/>
+      <w:lvlJc w:val="left"/>
+      <w:pPr>
+        <w:tabs>
+          <w:tab w:val="num" w:pos="2160"/>
+        </w:tabs>
+        <w:ind w:left="2160" w:hanging="360"/>
+      </w:pPr>
+    </w:lvl>
+    <w:lvl w:ilvl="3" w:tentative="1">
+      <w:start w:val="1"/>
+      <w:numFmt w:val="decimal"/>
+      <w:lvlText w:val="%4."/>
+      <w:lvlJc w:val="left"/>
+      <w:pPr>
+        <w:tabs>
+          <w:tab w:val="num" w:pos="2880"/>
+        </w:tabs>
+        <w:ind w:left="2880" w:hanging="360"/>
+      </w:pPr>
+    </w:lvl>
+    <w:lvl w:ilvl="4" w:tentative="1">
+      <w:start w:val="1"/>
+      <w:numFmt w:val="decimal"/>
+      <w:lvlText w:val="%5."/>
+      <w:lvlJc w:val="left"/>
+      <w:pPr>
+        <w:tabs>
+          <w:tab w:val="num" w:pos="3600"/>
+        </w:tabs>
+        <w:ind w:left="3600" w:hanging="360"/>
+      </w:pPr>
+    </w:lvl>
+    <w:lvl w:ilvl="5" w:tentative="1">
+      <w:start w:val="1"/>
+      <w:numFmt w:val="decimal"/>
+      <w:lvlText w:val="%6."/>
+      <w:lvlJc w:val="left"/>
+      <w:pPr>
+        <w:tabs>
+          <w:tab w:val="num" w:pos="4320"/>
+        </w:tabs>
+        <w:ind w:left="4320" w:hanging="360"/>
+      </w:pPr>
+    </w:lvl>
+    <w:lvl w:ilvl="6" w:tentative="1">
+      <w:start w:val="1"/>
+      <w:numFmt w:val="decimal"/>
+      <w:lvlText w:val="%7."/>
+      <w:lvlJc w:val="left"/>
+      <w:pPr>
+        <w:tabs>
+          <w:tab w:val="num" w:pos="5040"/>
+        </w:tabs>
+        <w:ind w:left="5040" w:hanging="360"/>
+      </w:pPr>
+    </w:lvl>
+    <w:lvl w:ilvl="7" w:tentative="1">
+      <w:start w:val="1"/>
+      <w:numFmt w:val="decimal"/>
+      <w:lvlText w:val="%8."/>
+      <w:lvlJc w:val="left"/>
+      <w:pPr>
+        <w:tabs>
+          <w:tab w:val="num" w:pos="5760"/>
+        </w:tabs>
+        <w:ind w:left="5760" w:hanging="360"/>
+      </w:pPr>
+    </w:lvl>
+    <w:lvl w:ilvl="8" w:tentative="1">
+      <w:start w:val="1"/>
+      <w:numFmt w:val="decimal"/>
+      <w:lvlText w:val="%9."/>
+      <w:lvlJc w:val="left"/>
+      <w:pPr>
+        <w:tabs>
+          <w:tab w:val="num" w:pos="6480"/>
+        </w:tabs>
+        <w:ind w:left="6480" w:hanging="360"/>
+      </w:pPr>
+    </w:lvl>
+  </w:abstractNum>
+  <w:abstractNum w:abstractNumId="2" w15:restartNumberingAfterBreak="0">
+    <w:nsid w:val="48790A69"/>
+    <w:multiLevelType w:val="multilevel"/>
+    <w:tmpl w:val="2E6663C8"/>
+    <w:lvl w:ilvl="0">
+      <w:start w:val="1"/>
+      <w:numFmt w:val="decimal"/>
+      <w:lvlText w:val="%1."/>
+      <w:lvlJc w:val="left"/>
+      <w:pPr>
+        <w:tabs>
+          <w:tab w:val="num" w:pos="720"/>
+        </w:tabs>
+        <w:ind w:left="720" w:hanging="360"/>
+      </w:pPr>
+    </w:lvl>
+    <w:lvl w:ilvl="1" w:tentative="1">
+      <w:start w:val="1"/>
+      <w:numFmt w:val="decimal"/>
+      <w:lvlText w:val="%2."/>
+      <w:lvlJc w:val="left"/>
+      <w:pPr>
+        <w:tabs>
+          <w:tab w:val="num" w:pos="1440"/>
+        </w:tabs>
+        <w:ind w:left="1440" w:hanging="360"/>
+      </w:pPr>
+    </w:lvl>
+    <w:lvl w:ilvl="2" w:tentative="1">
+      <w:start w:val="1"/>
+      <w:numFmt w:val="decimal"/>
+      <w:lvlText w:val="%3."/>
+      <w:lvlJc w:val="left"/>
+      <w:pPr>
+        <w:tabs>
+          <w:tab w:val="num" w:pos="2160"/>
+        </w:tabs>
+        <w:ind w:left="2160" w:hanging="360"/>
+      </w:pPr>
+    </w:lvl>
+    <w:lvl w:ilvl="3" w:tentative="1">
+      <w:start w:val="1"/>
+      <w:numFmt w:val="decimal"/>
+      <w:lvlText w:val="%4."/>
+      <w:lvlJc w:val="left"/>
+      <w:pPr>
+        <w:tabs>
+          <w:tab w:val="num" w:pos="2880"/>
+        </w:tabs>
+        <w:ind w:left="2880" w:hanging="360"/>
+      </w:pPr>
+    </w:lvl>
+    <w:lvl w:ilvl="4" w:tentative="1">
+      <w:start w:val="1"/>
+      <w:numFmt w:val="decimal"/>
+      <w:lvlText w:val="%5."/>
+      <w:lvlJc w:val="left"/>
+      <w:pPr>
+        <w:tabs>
+          <w:tab w:val="num" w:pos="3600"/>
+        </w:tabs>
+        <w:ind w:left="3600" w:hanging="360"/>
+      </w:pPr>
+    </w:lvl>
+    <w:lvl w:ilvl="5" w:tentative="1">
+      <w:start w:val="1"/>
+      <w:numFmt w:val="decimal"/>
+      <w:lvlText w:val="%6."/>
+      <w:lvlJc w:val="left"/>
+      <w:pPr>
+        <w:tabs>
+          <w:tab w:val="num" w:pos="4320"/>
+        </w:tabs>
+        <w:ind w:left="4320" w:hanging="360"/>
+      </w:pPr>
+    </w:lvl>
+    <w:lvl w:ilvl="6" w:tentative="1">
+      <w:start w:val="1"/>
+      <w:numFmt w:val="decimal"/>
+      <w:lvlText w:val="%7."/>
+      <w:lvlJc w:val="left"/>
+      <w:pPr>
+        <w:tabs>
+          <w:tab w:val="num" w:pos="5040"/>
+        </w:tabs>
+        <w:ind w:left="5040" w:hanging="360"/>
+      </w:pPr>
+    </w:lvl>
+    <w:lvl w:ilvl="7" w:tentative="1">
+      <w:start w:val="1"/>
+      <w:numFmt w:val="decimal"/>
+      <w:lvlText w:val="%8."/>
+      <w:lvlJc w:val="left"/>
+      <w:pPr>
+        <w:tabs>
+          <w:tab w:val="num" w:pos="5760"/>
+        </w:tabs>
+        <w:ind w:left="5760" w:hanging="360"/>
+      </w:pPr>
+    </w:lvl>
+    <w:lvl w:ilvl="8" w:tentative="1">
+      <w:start w:val="1"/>
+      <w:numFmt w:val="decimal"/>
+      <w:lvlText w:val="%9."/>
+      <w:lvlJc w:val="left"/>
+      <w:pPr>
+        <w:tabs>
+          <w:tab w:val="num" w:pos="6480"/>
+        </w:tabs>
+        <w:ind w:left="6480" w:hanging="360"/>
+      </w:pPr>
+    </w:lvl>
+  </w:abstractNum>
+  <w:abstractNum w:abstractNumId="3" w15:restartNumberingAfterBreak="0">
+    <w:nsid w:val="6E1A2E66"/>
+    <w:multiLevelType w:val="multilevel"/>
+    <w:tmpl w:val="67F239CA"/>
+    <w:lvl w:ilvl="0">
+      <w:start w:val="1"/>
+      <w:numFmt w:val="bullet"/>
+      <w:lvlText w:val=""/>
+      <w:lvlJc w:val="left"/>
+      <w:pPr>
+        <w:tabs>
+          <w:tab w:val="num" w:pos="720"/>
+        </w:tabs>
+        <w:ind w:left="720" w:hanging="360"/>
+      </w:pPr>
+      <w:rPr>
+        <w:rFonts w:ascii="Symbol" w:hAnsi="Symbol" w:hint="default"/>
+        <w:sz w:val="20"/>
+      </w:rPr>
+    </w:lvl>
+    <w:lvl w:ilvl="1" w:tentative="1">
+      <w:start w:val="1"/>
+      <w:numFmt w:val="bullet"/>
+      <w:lvlText w:val=""/>
+      <w:lvlJc w:val="left"/>
+      <w:pPr>
+        <w:tabs>
+          <w:tab w:val="num" w:pos="1440"/>
+        </w:tabs>
+        <w:ind w:left="1440" w:hanging="360"/>
+      </w:pPr>
+      <w:rPr>
+        <w:rFonts w:ascii="Symbol" w:hAnsi="Symbol" w:hint="default"/>
+        <w:sz w:val="20"/>
+      </w:rPr>
+    </w:lvl>
+    <w:lvl w:ilvl="2" w:tentative="1">
+      <w:start w:val="1"/>
+      <w:numFmt w:val="bullet"/>
+      <w:lvlText w:val=""/>
+      <w:lvlJc w:val="left"/>
+      <w:pPr>
+        <w:tabs>
+          <w:tab w:val="num" w:pos="2160"/>
+        </w:tabs>
+        <w:ind w:left="2160" w:hanging="360"/>
+      </w:pPr>
+      <w:rPr>
+        <w:rFonts w:ascii="Symbol" w:hAnsi="Symbol" w:hint="default"/>
+        <w:sz w:val="20"/>
+      </w:rPr>
+    </w:lvl>
+    <w:lvl w:ilvl="3" w:tentative="1">
+      <w:start w:val="1"/>
+      <w:numFmt w:val="bullet"/>
+      <w:lvlText w:val=""/>
+      <w:lvlJc w:val="left"/>
+      <w:pPr>
+        <w:tabs>
+          <w:tab w:val="num" w:pos="2880"/>
+        </w:tabs>
+        <w:ind w:left="2880" w:hanging="360"/>
+      </w:pPr>
+      <w:rPr>
+        <w:rFonts w:ascii="Symbol" w:hAnsi="Symbol" w:hint="default"/>
+        <w:sz w:val="20"/>
+      </w:rPr>
+    </w:lvl>
+    <w:lvl w:ilvl="4" w:tentative="1">
+      <w:start w:val="1"/>
+      <w:numFmt w:val="bullet"/>
+      <w:lvlText w:val=""/>
+      <w:lvlJc w:val="left"/>
+      <w:pPr>
+        <w:tabs>
+          <w:tab w:val="num" w:pos="3600"/>
+        </w:tabs>
+        <w:ind w:left="3600" w:hanging="360"/>
+      </w:pPr>
+      <w:rPr>
+        <w:rFonts w:ascii="Symbol" w:hAnsi="Symbol" w:hint="default"/>
+        <w:sz w:val="20"/>
+      </w:rPr>
+    </w:lvl>
+    <w:lvl w:ilvl="5" w:tentative="1">
+      <w:start w:val="1"/>
+      <w:numFmt w:val="bullet"/>
+      <w:lvlText w:val=""/>
+      <w:lvlJc w:val="left"/>
+      <w:pPr>
+        <w:tabs>
+          <w:tab w:val="num" w:pos="4320"/>
+        </w:tabs>
+        <w:ind w:left="4320" w:hanging="360"/>
+      </w:pPr>
+      <w:rPr>
+        <w:rFonts w:ascii="Symbol" w:hAnsi="Symbol" w:hint="default"/>
+        <w:sz w:val="20"/>
+      </w:rPr>
+    </w:lvl>
+    <w:lvl w:ilvl="6" w:tentative="1">
+      <w:start w:val="1"/>
+      <w:numFmt w:val="bullet"/>
+      <w:lvlText w:val=""/>
+      <w:lvlJc w:val="left"/>
+      <w:pPr>
+        <w:tabs>
+          <w:tab w:val="num" w:pos="5040"/>
+        </w:tabs>
+        <w:ind w:left="5040" w:hanging="360"/>
+      </w:pPr>
+      <w:rPr>
+        <w:rFonts w:ascii="Symbol" w:hAnsi="Symbol" w:hint="default"/>
+        <w:sz w:val="20"/>
+      </w:rPr>
+    </w:lvl>
+    <w:lvl w:ilvl="7" w:tentative="1">
+      <w:start w:val="1"/>
+      <w:numFmt w:val="bullet"/>
+      <w:lvlText w:val=""/>
+      <w:lvlJc w:val="left"/>
+      <w:pPr>
+        <w:tabs>
+          <w:tab w:val="num" w:pos="5760"/>
+        </w:tabs>
+        <w:ind w:left="5760" w:hanging="360"/>
+      </w:pPr>
+      <w:rPr>
+        <w:rFonts w:ascii="Symbol" w:hAnsi="Symbol" w:hint="default"/>
+        <w:sz w:val="20"/>
+      </w:rPr>
+    </w:lvl>
+    <w:lvl w:ilvl="8" w:tentative="1">
+      <w:start w:val="1"/>
+      <w:numFmt w:val="bullet"/>
+      <w:lvlText w:val=""/>
+      <w:lvlJc w:val="left"/>
+      <w:pPr>
+        <w:tabs>
+          <w:tab w:val="num" w:pos="6480"/>
+        </w:tabs>
+        <w:ind w:left="6480" w:hanging="360"/>
+      </w:pPr>
+      <w:rPr>
+        <w:rFonts w:ascii="Symbol" w:hAnsi="Symbol" w:hint="default"/>
+        <w:sz w:val="20"/>
+      </w:rPr>
+    </w:lvl>
+  </w:abstractNum>
+  <w:abstractNum w:abstractNumId="4" w15:restartNumberingAfterBreak="0">
+    <w:nsid w:val="7FF24A8D"/>
+    <w:multiLevelType w:val="multilevel"/>
+    <w:tmpl w:val="A0F2DFCA"/>
+    <w:lvl w:ilvl="0">
+      <w:start w:val="1"/>
+      <w:numFmt w:val="decimal"/>
+      <w:lvlText w:val="%1."/>
+      <w:lvlJc w:val="left"/>
+      <w:pPr>
+        <w:tabs>
+          <w:tab w:val="num" w:pos="720"/>
+        </w:tabs>
+        <w:ind w:left="720" w:hanging="360"/>
+      </w:pPr>
+    </w:lvl>
+    <w:lvl w:ilvl="1" w:tentative="1">
+      <w:start w:val="1"/>
+      <w:numFmt w:val="decimal"/>
+      <w:lvlText w:val="%2."/>
+      <w:lvlJc w:val="left"/>
+      <w:pPr>
+        <w:tabs>
+          <w:tab w:val="num" w:pos="1440"/>
+        </w:tabs>
+        <w:ind w:left="1440" w:hanging="360"/>
+      </w:pPr>
+    </w:lvl>
+    <w:lvl w:ilvl="2" w:tentative="1">
+      <w:start w:val="1"/>
+      <w:numFmt w:val="decimal"/>
+      <w:lvlText w:val="%3."/>
+      <w:lvlJc w:val="left"/>
+      <w:pPr>
+        <w:tabs>
+          <w:tab w:val="num" w:pos="2160"/>
+        </w:tabs>
+        <w:ind w:left="2160" w:hanging="360"/>
+      </w:pPr>
+    </w:lvl>
+    <w:lvl w:ilvl="3" w:tentative="1">
+      <w:start w:val="1"/>
+      <w:numFmt w:val="decimal"/>
+      <w:lvlText w:val="%4."/>
+      <w:lvlJc w:val="left"/>
+      <w:pPr>
+        <w:tabs>
+          <w:tab w:val="num" w:pos="2880"/>
+        </w:tabs>
+        <w:ind w:left="2880" w:hanging="360"/>
+      </w:pPr>
+    </w:lvl>
+    <w:lvl w:ilvl="4" w:tentative="1">
+      <w:start w:val="1"/>
+      <w:numFmt w:val="decimal"/>
+      <w:lvlText w:val="%5."/>
+      <w:lvlJc w:val="left"/>
+      <w:pPr>
+        <w:tabs>
+          <w:tab w:val="num" w:pos="3600"/>
+        </w:tabs>
+        <w:ind w:left="3600" w:hanging="360"/>
+      </w:pPr>
+    </w:lvl>
+    <w:lvl w:ilvl="5" w:tentative="1">
+      <w:start w:val="1"/>
+      <w:numFmt w:val="decimal"/>
+      <w:lvlText w:val="%6."/>
+      <w:lvlJc w:val="left"/>
+      <w:pPr>
+        <w:tabs>
+          <w:tab w:val="num" w:pos="4320"/>
+        </w:tabs>
+        <w:ind w:left="4320" w:hanging="360"/>
+      </w:pPr>
+    </w:lvl>
+    <w:lvl w:ilvl="6" w:tentative="1">
+      <w:start w:val="1"/>
+      <w:numFmt w:val="decimal"/>
+      <w:lvlText w:val="%7."/>
+      <w:lvlJc w:val="left"/>
+      <w:pPr>
+        <w:tabs>
+          <w:tab w:val="num" w:pos="5040"/>
+        </w:tabs>
+        <w:ind w:left="5040" w:hanging="360"/>
+      </w:pPr>
+    </w:lvl>
+    <w:lvl w:ilvl="7" w:tentative="1">
+      <w:start w:val="1"/>
+      <w:numFmt w:val="decimal"/>
+      <w:lvlText w:val="%8."/>
+      <w:lvlJc w:val="left"/>
+      <w:pPr>
+        <w:tabs>
+          <w:tab w:val="num" w:pos="5760"/>
+        </w:tabs>
+        <w:ind w:left="5760" w:hanging="360"/>
+      </w:pPr>
+    </w:lvl>
+    <w:lvl w:ilvl="8" w:tentative="1">
+      <w:start w:val="1"/>
+      <w:numFmt w:val="decimal"/>
+      <w:lvlText w:val="%9."/>
+      <w:lvlJc w:val="left"/>
+      <w:pPr>
+        <w:tabs>
+          <w:tab w:val="num" w:pos="6480"/>
+        </w:tabs>
+        <w:ind w:left="6480" w:hanging="360"/>
+      </w:pPr>
+    </w:lvl>
+  </w:abstractNum>
+  <w:num w:numId="1" w16cid:durableId="337659373">
+    <w:abstractNumId w:val="1"/>
+  </w:num>
+  <w:num w:numId="2" w16cid:durableId="682896239">
+    <w:abstractNumId w:val="2"/>
+  </w:num>
+  <w:num w:numId="3" w16cid:durableId="57367001">
+    <w:abstractNumId w:val="4"/>
+  </w:num>
+  <w:num w:numId="4" w16cid:durableId="834535514">
+    <w:abstractNumId w:val="3"/>
+  </w:num>
+  <w:num w:numId="5" w16cid:durableId="447624899">
+    <w:abstractNumId w:val="0"/>
+  </w:num>
+</w:numbering>
 </file>
 
 <file path=word/styles.xml><?xml version="1.0" encoding="utf-8"?>
@@ -643,7 +2255,6 @@
     <w:next w:val="Normal"/>
     <w:link w:val="Heading3Char"/>
     <w:uiPriority w:val="9"/>
-    <w:semiHidden/>
     <w:unhideWhenUsed/>
     <w:qFormat/>
     <w:rsid w:val="00A90FDC"/>
@@ -795,7 +2406,6 @@
   <w:style w:type="character" w:default="1" w:styleId="DefaultParagraphFont">
     <w:name w:val="Default Paragraph Font"/>
     <w:uiPriority w:val="1"/>
-    <w:semiHidden/>
     <w:unhideWhenUsed/>
   </w:style>
   <w:style w:type="table" w:default="1" w:styleId="TableNormal">
@@ -851,7 +2461,6 @@
     <w:basedOn w:val="DefaultParagraphFont"/>
     <w:link w:val="Heading3"/>
     <w:uiPriority w:val="9"/>
-    <w:semiHidden/>
     <w:rsid w:val="00A90FDC"/>
     <w:rPr>
       <w:rFonts w:eastAsiaTheme="majorEastAsia" w:cstheme="majorBidi"/>
@@ -1130,6 +2739,19 @@
     <w:rPr>
       <w:color w:val="605E5C"/>
       <w:shd w:val="clear" w:color="auto" w:fill="E1DFDD"/>
+    </w:rPr>
+  </w:style>
+  <w:style w:type="paragraph" w:styleId="NormalWeb">
+    <w:name w:val="Normal (Web)"/>
+    <w:basedOn w:val="Normal"/>
+    <w:uiPriority w:val="99"/>
+    <w:semiHidden/>
+    <w:unhideWhenUsed/>
+    <w:rsid w:val="00CB66AC"/>
+    <w:rPr>
+      <w:rFonts w:ascii="Times New Roman" w:hAnsi="Times New Roman" w:cs="Times New Roman"/>
+      <w:sz w:val="24"/>
+      <w:szCs w:val="24"/>
     </w:rPr>
   </w:style>
 </w:styles>

</xml_diff>